<commit_message>
add  loading modal for Generation Exam Button
</commit_message>
<xml_diff>
--- a/templates_files/exam_template.docx
+++ b/templates_files/exam_template.docx
@@ -10,456 +10,10 @@
         <mc:AlternateContent>
           <mc:Choice Requires="wps">
             <w:drawing>
-              <wp:anchor distT="45720" distB="45720" distL="114300" distR="114300" simplePos="0" relativeHeight="251663360" behindDoc="0" locked="0" layoutInCell="1" allowOverlap="1" wp14:anchorId="29DB311B" wp14:editId="247FD740">
+              <wp:anchor distT="45720" distB="45720" distL="114300" distR="114300" simplePos="0" relativeHeight="251659264" behindDoc="0" locked="0" layoutInCell="1" allowOverlap="1" wp14:anchorId="44E98699" wp14:editId="2D77F5F1">
                 <wp:simplePos x="0" y="0"/>
                 <wp:positionH relativeFrom="margin">
-                  <wp:posOffset>4907280</wp:posOffset>
-                </wp:positionH>
-                <wp:positionV relativeFrom="paragraph">
-                  <wp:posOffset>3810</wp:posOffset>
-                </wp:positionV>
-                <wp:extent cx="2110740" cy="1059180"/>
-                <wp:effectExtent l="0" t="0" r="3810" b="7620"/>
-                <wp:wrapSquare wrapText="bothSides"/>
-                <wp:docPr id="1209906503" name="Text Box 2"/>
-                <wp:cNvGraphicFramePr>
-                  <a:graphicFrameLocks xmlns:a="http://schemas.openxmlformats.org/drawingml/2006/main"/>
-                </wp:cNvGraphicFramePr>
-                <a:graphic xmlns:a="http://schemas.openxmlformats.org/drawingml/2006/main">
-                  <a:graphicData uri="http://schemas.microsoft.com/office/word/2010/wordprocessingShape">
-                    <wps:wsp>
-                      <wps:cNvSpPr txBox="1">
-                        <a:spLocks noChangeArrowheads="1"/>
-                      </wps:cNvSpPr>
-                      <wps:spPr bwMode="auto">
-                        <a:xfrm>
-                          <a:off x="0" y="0"/>
-                          <a:ext cx="2110740" cy="1059180"/>
-                        </a:xfrm>
-                        <a:prstGeom prst="rect">
-                          <a:avLst/>
-                        </a:prstGeom>
-                        <a:solidFill>
-                          <a:srgbClr val="FFFFFF"/>
-                        </a:solidFill>
-                        <a:ln w="9525">
-                          <a:noFill/>
-                          <a:miter lim="800000"/>
-                          <a:headEnd/>
-                          <a:tailEnd/>
-                        </a:ln>
-                      </wps:spPr>
-                      <wps:txbx>
-                        <w:txbxContent>
-                          <w:p>
-                            <w:pPr>
-                              <w:spacing w:after="0" w:line="240" w:lineRule="auto"/>
-                              <w:rPr>
-                                <w:b/>
-                                <w:bCs/>
-                                <w:lang w:bidi="ar-YE"/>
-                              </w:rPr>
-                            </w:pPr>
-                            <w:r>
-                              <w:rPr>
-                                <w:b/>
-                                <w:bCs/>
-                                <w:lang w:bidi="ar-YE"/>
-                              </w:rPr>
-                              <w:t>Republic of Yemen</w:t>
-                            </w:r>
-                          </w:p>
-                          <w:p>
-                            <w:pPr>
-                              <w:spacing w:after="0" w:line="240" w:lineRule="auto"/>
-                              <w:rPr>
-                                <w:b/>
-                                <w:bCs/>
-                                <w:rtl/>
-                                <w:lang w:bidi="ar-YE"/>
-                              </w:rPr>
-                            </w:pPr>
-                            <w:r>
-                              <w:rPr>
-                                <w:b/>
-                                <w:bCs/>
-                                <w:lang w:bidi="ar-YE"/>
-                              </w:rPr>
-                              <w:t>Ministry of Education</w:t>
-                            </w:r>
-                            <w:r>
-                              <w:rPr>
-                                <w:b/>
-                                <w:bCs/>
-                                <w:rtl/>
-                                <w:lang w:bidi="ar-YE"/>
-                              </w:rPr>
-                              <w:br/>
-                            </w:r>
-                            <w:r>
-                              <w:rPr>
-                                <w:b/>
-                                <w:bCs/>
-                                <w:lang w:bidi="ar-YE"/>
-                              </w:rPr>
-                              <w:t>University of Saba Region</w:t>
-                            </w:r>
-                          </w:p>
-                        </w:txbxContent>
-                      </wps:txbx>
-                      <wps:bodyPr rot="0" vert="horz" wrap="square" lIns="91440" tIns="45720" rIns="91440" bIns="45720" anchor="t" anchorCtr="0">
-                        <a:noAutofit/>
-                      </wps:bodyPr>
-                    </wps:wsp>
-                  </a:graphicData>
-                </a:graphic>
-                <wp14:sizeRelH relativeFrom="margin">
-                  <wp14:pctWidth>0</wp14:pctWidth>
-                </wp14:sizeRelH>
-                <wp14:sizeRelV relativeFrom="margin">
-                  <wp14:pctHeight>0</wp14:pctHeight>
-                </wp14:sizeRelV>
-              </wp:anchor>
-            </w:drawing>
-          </mc:Choice>
-          <mc:Fallback>
-            <w:pict>
-              <v:shapetype w14:anchorId="29DB311B" id="_x0000_t202" coordsize="21600,21600" o:spt="202" path="m,l,21600r21600,l21600,xe">
-                <v:stroke joinstyle="miter"/>
-                <v:path gradientshapeok="t" o:connecttype="rect"/>
-              </v:shapetype>
-              <v:shape id="Text Box 2" o:spid="_x0000_s1026" type="#_x0000_t202" style="position:absolute;margin-left:386.4pt;margin-top:.3pt;width:166.2pt;height:83.4pt;z-index:251663360;visibility:visible;mso-wrap-style:square;mso-width-percent:0;mso-height-percent:0;mso-wrap-distance-left:9pt;mso-wrap-distance-top:3.6pt;mso-wrap-distance-right:9pt;mso-wrap-distance-bottom:3.6pt;mso-position-horizontal:absolute;mso-position-horizontal-relative:margin;mso-position-vertical:absolute;mso-position-vertical-relative:text;mso-width-percent:0;mso-height-percent:0;mso-width-relative:margin;mso-height-relative:margin;v-text-anchor:top" o:gfxdata="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" stroked="f">
-                <v:textbox>
-                  <w:txbxContent>
-                    <w:p>
-                      <w:pPr>
-                        <w:spacing w:after="0" w:line="240" w:lineRule="auto"/>
-                        <w:rPr>
-                          <w:b/>
-                          <w:bCs/>
-                          <w:lang w:bidi="ar-YE"/>
-                        </w:rPr>
-                      </w:pPr>
-                      <w:r>
-                        <w:rPr>
-                          <w:b/>
-                          <w:bCs/>
-                          <w:lang w:bidi="ar-YE"/>
-                        </w:rPr>
-                        <w:t>Republic of Yemen</w:t>
-                      </w:r>
-                    </w:p>
-                    <w:p>
-                      <w:pPr>
-                        <w:spacing w:after="0" w:line="240" w:lineRule="auto"/>
-                        <w:rPr>
-                          <w:b/>
-                          <w:bCs/>
-                          <w:rtl/>
-                          <w:lang w:bidi="ar-YE"/>
-                        </w:rPr>
-                      </w:pPr>
-                      <w:r>
-                        <w:rPr>
-                          <w:b/>
-                          <w:bCs/>
-                          <w:lang w:bidi="ar-YE"/>
-                        </w:rPr>
-                        <w:t>Ministry of Education</w:t>
-                      </w:r>
-                      <w:r>
-                        <w:rPr>
-                          <w:b/>
-                          <w:bCs/>
-                          <w:rtl/>
-                          <w:lang w:bidi="ar-YE"/>
-                        </w:rPr>
-                        <w:br/>
-                      </w:r>
-                      <w:r>
-                        <w:rPr>
-                          <w:b/>
-                          <w:bCs/>
-                          <w:lang w:bidi="ar-YE"/>
-                        </w:rPr>
-                        <w:t>University of Saba Region</w:t>
-                      </w:r>
-                    </w:p>
-                  </w:txbxContent>
-                </v:textbox>
-                <w10:wrap type="square" anchorx="margin"/>
-              </v:shape>
-            </w:pict>
-          </mc:Fallback>
-        </mc:AlternateContent>
-      </w:r>
-      <w:r>
-        <w:rPr>
-          <w:noProof/>
-        </w:rPr>
-        <mc:AlternateContent>
-          <mc:Choice Requires="wps">
-            <w:drawing>
-              <wp:anchor distT="45720" distB="45720" distL="114300" distR="114300" simplePos="0" relativeHeight="251661312" behindDoc="0" locked="0" layoutInCell="1" allowOverlap="1" wp14:anchorId="2CAEC779" wp14:editId="3D70F06C">
-                <wp:simplePos x="0" y="0"/>
-                <wp:positionH relativeFrom="column">
-                  <wp:posOffset>-99060</wp:posOffset>
-                </wp:positionH>
-                <wp:positionV relativeFrom="paragraph">
-                  <wp:posOffset>3810</wp:posOffset>
-                </wp:positionV>
-                <wp:extent cx="3048000" cy="735330"/>
-                <wp:effectExtent l="0" t="0" r="0" b="7620"/>
-                <wp:wrapSquare wrapText="bothSides"/>
-                <wp:docPr id="1466583984" name="Text Box 2"/>
-                <wp:cNvGraphicFramePr>
-                  <a:graphicFrameLocks xmlns:a="http://schemas.openxmlformats.org/drawingml/2006/main"/>
-                </wp:cNvGraphicFramePr>
-                <a:graphic xmlns:a="http://schemas.openxmlformats.org/drawingml/2006/main">
-                  <a:graphicData uri="http://schemas.microsoft.com/office/word/2010/wordprocessingShape">
-                    <wps:wsp>
-                      <wps:cNvSpPr txBox="1">
-                        <a:spLocks noChangeArrowheads="1"/>
-                      </wps:cNvSpPr>
-                      <wps:spPr bwMode="auto">
-                        <a:xfrm>
-                          <a:off x="0" y="0"/>
-                          <a:ext cx="3048000" cy="735330"/>
-                        </a:xfrm>
-                        <a:prstGeom prst="rect">
-                          <a:avLst/>
-                        </a:prstGeom>
-                        <a:solidFill>
-                          <a:srgbClr val="FFFFFF"/>
-                        </a:solidFill>
-                        <a:ln w="9525">
-                          <a:noFill/>
-                          <a:miter lim="800000"/>
-                          <a:headEnd/>
-                          <a:tailEnd/>
-                        </a:ln>
-                      </wps:spPr>
-                      <wps:txbx>
-                        <w:txbxContent>
-                          <w:p>
-                            <w:r>
-                              <w:t xml:space="preserve">Subject: </w:t>
-                            </w:r>
-                            <w:proofErr w:type="gramStart"/>
-                            <w:r>
-                              <w:t xml:space="preserve">{{ </w:t>
-                            </w:r>
-                            <w:proofErr w:type="spellStart"/>
-                            <w:r>
-                              <w:rPr>
-                                <w:b/>
-                                <w:bCs/>
-                              </w:rPr>
-                              <w:t>exam</w:t>
-                            </w:r>
-                            <w:proofErr w:type="gramEnd"/>
-                            <w:r>
-                              <w:rPr>
-                                <w:b/>
-                                <w:bCs/>
-                              </w:rPr>
-                              <w:t>_title</w:t>
-                            </w:r>
-                            <w:proofErr w:type="spellEnd"/>
-                            <w:r>
-                              <w:t xml:space="preserve"> }}</w:t>
-                            </w:r>
-                            <w:r>
-                              <w:br/>
-                              <w:t xml:space="preserve">Date: </w:t>
-                            </w:r>
-                            <w:proofErr w:type="gramStart"/>
-                            <w:r>
-                              <w:t xml:space="preserve">{{ </w:t>
-                            </w:r>
-                            <w:proofErr w:type="spellStart"/>
-                            <w:r>
-                              <w:t>exam</w:t>
-                            </w:r>
-                            <w:proofErr w:type="gramEnd"/>
-                            <w:r>
-                              <w:t>_date</w:t>
-                            </w:r>
-                            <w:proofErr w:type="spellEnd"/>
-                            <w:r>
-                              <w:t>}}</w:t>
-                            </w:r>
-                            <w:r>
-                              <w:br/>
-                              <w:t xml:space="preserve">Number of Questions: </w:t>
-                            </w:r>
-                            <w:proofErr w:type="gramStart"/>
-                            <w:r>
-                              <w:t xml:space="preserve">{{ </w:t>
-                            </w:r>
-                            <w:proofErr w:type="spellStart"/>
-                            <w:r>
-                              <w:rPr>
-                                <w:b/>
-                                <w:bCs/>
-                              </w:rPr>
-                              <w:t>num</w:t>
-                            </w:r>
-                            <w:proofErr w:type="gramEnd"/>
-                            <w:r>
-                              <w:rPr>
-                                <w:b/>
-                                <w:bCs/>
-                              </w:rPr>
-                              <w:t>_</w:t>
-                            </w:r>
-                            <w:proofErr w:type="gramStart"/>
-                            <w:r>
-                              <w:rPr>
-                                <w:b/>
-                                <w:bCs/>
-                              </w:rPr>
-                              <w:t>questions</w:t>
-                            </w:r>
-                            <w:proofErr w:type="spellEnd"/>
-                            <w:r>
-                              <w:t xml:space="preserve"> }</w:t>
-                            </w:r>
-                            <w:proofErr w:type="gramEnd"/>
-                            <w:r>
-                              <w:t>}</w:t>
-                            </w:r>
-                          </w:p>
-                        </w:txbxContent>
-                      </wps:txbx>
-                      <wps:bodyPr rot="0" vert="horz" wrap="square" lIns="91440" tIns="45720" rIns="91440" bIns="45720" anchor="t" anchorCtr="0">
-                        <a:noAutofit/>
-                      </wps:bodyPr>
-                    </wps:wsp>
-                  </a:graphicData>
-                </a:graphic>
-                <wp14:sizeRelH relativeFrom="margin">
-                  <wp14:pctWidth>0</wp14:pctWidth>
-                </wp14:sizeRelH>
-                <wp14:sizeRelV relativeFrom="margin">
-                  <wp14:pctHeight>0</wp14:pctHeight>
-                </wp14:sizeRelV>
-              </wp:anchor>
-            </w:drawing>
-          </mc:Choice>
-          <mc:Fallback>
-            <w:pict>
-              <v:shape w14:anchorId="2CAEC779" id="_x0000_s1027" type="#_x0000_t202" style="position:absolute;margin-left:-7.8pt;margin-top:.3pt;width:240pt;height:57.9pt;z-index:251661312;visibility:visible;mso-wrap-style:square;mso-width-percent:0;mso-height-percent:0;mso-wrap-distance-left:9pt;mso-wrap-distance-top:3.6pt;mso-wrap-distance-right:9pt;mso-wrap-distance-bottom:3.6pt;mso-position-horizontal:absolute;mso-position-horizontal-relative:text;mso-position-vertical:absolute;mso-position-vertical-relative:text;mso-width-percent:0;mso-height-percent:0;mso-width-relative:margin;mso-height-relative:margin;v-text-anchor:top" o:gfxdata="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" stroked="f">
-                <v:textbox>
-                  <w:txbxContent>
-                    <w:p>
-                      <w:r>
-                        <w:t xml:space="preserve">Subject: </w:t>
-                      </w:r>
-                      <w:proofErr w:type="gramStart"/>
-                      <w:r>
-                        <w:t xml:space="preserve">{{ </w:t>
-                      </w:r>
-                      <w:proofErr w:type="spellStart"/>
-                      <w:r>
-                        <w:rPr>
-                          <w:b/>
-                          <w:bCs/>
-                        </w:rPr>
-                        <w:t>exam</w:t>
-                      </w:r>
-                      <w:proofErr w:type="gramEnd"/>
-                      <w:r>
-                        <w:rPr>
-                          <w:b/>
-                          <w:bCs/>
-                        </w:rPr>
-                        <w:t>_title</w:t>
-                      </w:r>
-                      <w:proofErr w:type="spellEnd"/>
-                      <w:r>
-                        <w:t xml:space="preserve"> }}</w:t>
-                      </w:r>
-                      <w:r>
-                        <w:br/>
-                        <w:t xml:space="preserve">Date: </w:t>
-                      </w:r>
-                      <w:proofErr w:type="gramStart"/>
-                      <w:r>
-                        <w:t xml:space="preserve">{{ </w:t>
-                      </w:r>
-                      <w:proofErr w:type="spellStart"/>
-                      <w:r>
-                        <w:t>exam</w:t>
-                      </w:r>
-                      <w:proofErr w:type="gramEnd"/>
-                      <w:r>
-                        <w:t>_date</w:t>
-                      </w:r>
-                      <w:proofErr w:type="spellEnd"/>
-                      <w:r>
-                        <w:t>}}</w:t>
-                      </w:r>
-                      <w:r>
-                        <w:br/>
-                        <w:t xml:space="preserve">Number of Questions: </w:t>
-                      </w:r>
-                      <w:proofErr w:type="gramStart"/>
-                      <w:r>
-                        <w:t xml:space="preserve">{{ </w:t>
-                      </w:r>
-                      <w:proofErr w:type="spellStart"/>
-                      <w:r>
-                        <w:rPr>
-                          <w:b/>
-                          <w:bCs/>
-                        </w:rPr>
-                        <w:t>num</w:t>
-                      </w:r>
-                      <w:proofErr w:type="gramEnd"/>
-                      <w:r>
-                        <w:rPr>
-                          <w:b/>
-                          <w:bCs/>
-                        </w:rPr>
-                        <w:t>_</w:t>
-                      </w:r>
-                      <w:proofErr w:type="gramStart"/>
-                      <w:r>
-                        <w:rPr>
-                          <w:b/>
-                          <w:bCs/>
-                        </w:rPr>
-                        <w:t>questions</w:t>
-                      </w:r>
-                      <w:proofErr w:type="spellEnd"/>
-                      <w:r>
-                        <w:t xml:space="preserve"> }</w:t>
-                      </w:r>
-                      <w:proofErr w:type="gramEnd"/>
-                      <w:r>
-                        <w:t>}</w:t>
-                      </w:r>
-                    </w:p>
-                  </w:txbxContent>
-                </v:textbox>
-                <w10:wrap type="square"/>
-              </v:shape>
-            </w:pict>
-          </mc:Fallback>
-        </mc:AlternateContent>
-      </w:r>
-      <w:r>
-        <w:rPr>
-          <w:noProof/>
-        </w:rPr>
-        <mc:AlternateContent>
-          <mc:Choice Requires="wps">
-            <w:drawing>
-              <wp:anchor distT="45720" distB="45720" distL="114300" distR="114300" simplePos="0" relativeHeight="251659264" behindDoc="0" locked="0" layoutInCell="1" allowOverlap="1" wp14:anchorId="44E98699" wp14:editId="5AF62C8C">
-                <wp:simplePos x="0" y="0"/>
-                <wp:positionH relativeFrom="margin">
-                  <wp:posOffset>2956560</wp:posOffset>
+                  <wp:posOffset>3129915</wp:posOffset>
                 </wp:positionH>
                 <wp:positionV relativeFrom="paragraph">
                   <wp:posOffset>3810</wp:posOffset>
@@ -574,7 +128,11 @@
           </mc:Choice>
           <mc:Fallback>
             <w:pict>
-              <v:shape w14:anchorId="44E98699" id="_x0000_s1028" type="#_x0000_t202" style="position:absolute;margin-left:232.8pt;margin-top:.3pt;width:84.6pt;height:69pt;z-index:251659264;visibility:visible;mso-wrap-style:square;mso-width-percent:0;mso-height-percent:0;mso-wrap-distance-left:9pt;mso-wrap-distance-top:3.6pt;mso-wrap-distance-right:9pt;mso-wrap-distance-bottom:3.6pt;mso-position-horizontal:absolute;mso-position-horizontal-relative:margin;mso-position-vertical:absolute;mso-position-vertical-relative:text;mso-width-percent:0;mso-height-percent:0;mso-width-relative:margin;mso-height-relative:margin;v-text-anchor:top" o:gfxdata="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" stroked="f">
+              <v:shapetype w14:anchorId="44E98699" id="_x0000_t202" coordsize="21600,21600" o:spt="202" path="m,l,21600r21600,l21600,xe">
+                <v:stroke joinstyle="miter"/>
+                <v:path gradientshapeok="t" o:connecttype="rect"/>
+              </v:shapetype>
+              <v:shape id="Text Box 2" o:spid="_x0000_s1026" type="#_x0000_t202" style="position:absolute;margin-left:246.45pt;margin-top:.3pt;width:84.6pt;height:69pt;z-index:251659264;visibility:visible;mso-wrap-style:square;mso-width-percent:0;mso-height-percent:0;mso-wrap-distance-left:9pt;mso-wrap-distance-top:3.6pt;mso-wrap-distance-right:9pt;mso-wrap-distance-bottom:3.6pt;mso-position-horizontal:absolute;mso-position-horizontal-relative:margin;mso-position-vertical:absolute;mso-position-vertical-relative:text;mso-width-percent:0;mso-height-percent:0;mso-width-relative:margin;mso-height-relative:margin;v-text-anchor:top" o:gfxdata="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" stroked="f">
                 <v:textbox>
                   <w:txbxContent>
                     <w:p>
@@ -603,7 +161,7 @@
                                     </pic:cNvPicPr>
                                   </pic:nvPicPr>
                                   <pic:blipFill>
-                                    <a:blip r:embed="rId7">
+                                    <a:blip r:embed="rId8">
                                       <a:extLst>
                                         <a:ext uri="{28A0092B-C50C-407E-A947-70E740481C1C}">
                                           <a14:useLocalDpi xmlns:a14="http://schemas.microsoft.com/office/drawing/2010/main" val="0"/>
@@ -633,6 +191,466 @@
                             </a:graphic>
                           </wp:inline>
                         </w:drawing>
+                      </w:r>
+                    </w:p>
+                  </w:txbxContent>
+                </v:textbox>
+                <w10:wrap type="square" anchorx="margin"/>
+              </v:shape>
+            </w:pict>
+          </mc:Fallback>
+        </mc:AlternateContent>
+      </w:r>
+      <w:r>
+        <w:rPr>
+          <w:noProof/>
+        </w:rPr>
+        <mc:AlternateContent>
+          <mc:Choice Requires="wps">
+            <w:drawing>
+              <wp:anchor distT="45720" distB="45720" distL="114300" distR="114300" simplePos="0" relativeHeight="251661312" behindDoc="0" locked="0" layoutInCell="1" allowOverlap="1" wp14:anchorId="2CAEC779" wp14:editId="29FE1EEE">
+                <wp:simplePos x="0" y="0"/>
+                <wp:positionH relativeFrom="column">
+                  <wp:posOffset>-98425</wp:posOffset>
+                </wp:positionH>
+                <wp:positionV relativeFrom="paragraph">
+                  <wp:posOffset>5080</wp:posOffset>
+                </wp:positionV>
+                <wp:extent cx="3009900" cy="941070"/>
+                <wp:effectExtent l="0" t="0" r="0" b="0"/>
+                <wp:wrapSquare wrapText="bothSides"/>
+                <wp:docPr id="1466583984" name="Text Box 2"/>
+                <wp:cNvGraphicFramePr>
+                  <a:graphicFrameLocks xmlns:a="http://schemas.openxmlformats.org/drawingml/2006/main"/>
+                </wp:cNvGraphicFramePr>
+                <a:graphic xmlns:a="http://schemas.openxmlformats.org/drawingml/2006/main">
+                  <a:graphicData uri="http://schemas.microsoft.com/office/word/2010/wordprocessingShape">
+                    <wps:wsp>
+                      <wps:cNvSpPr txBox="1">
+                        <a:spLocks noChangeArrowheads="1"/>
+                      </wps:cNvSpPr>
+                      <wps:spPr bwMode="auto">
+                        <a:xfrm>
+                          <a:off x="0" y="0"/>
+                          <a:ext cx="3009900" cy="941070"/>
+                        </a:xfrm>
+                        <a:prstGeom prst="rect">
+                          <a:avLst/>
+                        </a:prstGeom>
+                        <a:solidFill>
+                          <a:srgbClr val="FFFFFF"/>
+                        </a:solidFill>
+                        <a:ln w="9525">
+                          <a:noFill/>
+                          <a:miter lim="800000"/>
+                          <a:headEnd/>
+                          <a:tailEnd/>
+                        </a:ln>
+                      </wps:spPr>
+                      <wps:txbx>
+                        <w:txbxContent>
+                          <w:p>
+                            <w:r>
+                              <w:t xml:space="preserve">Subject: </w:t>
+                            </w:r>
+                            <w:proofErr w:type="gramStart"/>
+                            <w:r>
+                              <w:t xml:space="preserve">{{ </w:t>
+                            </w:r>
+                            <w:r>
+                              <w:rPr>
+                                <w:b/>
+                                <w:bCs/>
+                              </w:rPr>
+                              <w:t>exam</w:t>
+                            </w:r>
+                            <w:proofErr w:type="gramEnd"/>
+                            <w:r>
+                              <w:rPr>
+                                <w:b/>
+                                <w:bCs/>
+                              </w:rPr>
+                              <w:t>_title</w:t>
+                            </w:r>
+                            <w:r>
+                              <w:t xml:space="preserve"> }}</w:t>
+                            </w:r>
+                            <w:r>
+                              <w:br/>
+                              <w:t xml:space="preserve">Date: </w:t>
+                            </w:r>
+                            <w:proofErr w:type="gramStart"/>
+                            <w:r>
+                              <w:t xml:space="preserve">{{ </w:t>
+                            </w:r>
+                            <w:r>
+                              <w:t>exam</w:t>
+                            </w:r>
+                            <w:proofErr w:type="gramEnd"/>
+                            <w:r>
+                              <w:t>_date</w:t>
+                            </w:r>
+                            <w:r>
+                              <w:t>}}</w:t>
+                            </w:r>
+                            <w:r>
+                              <w:br/>
+                              <w:t xml:space="preserve">Number of Questions: </w:t>
+                            </w:r>
+                            <w:proofErr w:type="gramStart"/>
+                            <w:r>
+                              <w:t xml:space="preserve">{{ </w:t>
+                            </w:r>
+                            <w:r>
+                              <w:rPr>
+                                <w:b/>
+                                <w:bCs/>
+                              </w:rPr>
+                              <w:t>num</w:t>
+                            </w:r>
+                            <w:proofErr w:type="gramEnd"/>
+                            <w:r>
+                              <w:rPr>
+                                <w:b/>
+                                <w:bCs/>
+                              </w:rPr>
+                              <w:t>_questions</w:t>
+                            </w:r>
+                            <w:r>
+                              <w:t xml:space="preserve"> }}</w:t>
+                            </w:r>
+                            <w:r>
+                              <w:rPr>
+                                <w:rtl/>
+                              </w:rPr>
+                              <w:br/>
+                            </w:r>
+                            <w:r>
+                              <w:t xml:space="preserve">Teacher: </w:t>
+                            </w:r>
+                            <w:proofErr w:type="gramStart"/>
+                            <w:r>
+                              <w:t xml:space="preserve">{{ </w:t>
+                            </w:r>
+                            <w:r>
+                              <w:t>teacher</w:t>
+                            </w:r>
+                            <w:proofErr w:type="gramEnd"/>
+                            <w:r>
+                              <w:t>_name</w:t>
+                            </w:r>
+                          </w:p>
+                          <w:p>
+                            <w:r>
+                              <w:t>}}</w:t>
+                            </w:r>
+                          </w:p>
+                        </w:txbxContent>
+                      </wps:txbx>
+                      <wps:bodyPr rot="0" vert="horz" wrap="square" lIns="91440" tIns="45720" rIns="91440" bIns="45720" anchor="t" anchorCtr="0">
+                        <a:noAutofit/>
+                      </wps:bodyPr>
+                    </wps:wsp>
+                  </a:graphicData>
+                </a:graphic>
+                <wp14:sizeRelH relativeFrom="margin">
+                  <wp14:pctWidth>0</wp14:pctWidth>
+                </wp14:sizeRelH>
+                <wp14:sizeRelV relativeFrom="margin">
+                  <wp14:pctHeight>0</wp14:pctHeight>
+                </wp14:sizeRelV>
+              </wp:anchor>
+            </w:drawing>
+          </mc:Choice>
+          <mc:Fallback>
+            <w:pict>
+              <v:shapetype w14:anchorId="2CAEC779" id="_x0000_t202" coordsize="21600,21600" o:spt="202" path="m,l,21600r21600,l21600,xe">
+                <v:stroke joinstyle="miter"/>
+                <v:path gradientshapeok="t" o:connecttype="rect"/>
+              </v:shapetype>
+              <v:shape id="_x0000_s1027" type="#_x0000_t202" style="position:absolute;margin-left:-7.75pt;margin-top:.4pt;width:237pt;height:74.1pt;z-index:251661312;visibility:visible;mso-wrap-style:square;mso-width-percent:0;mso-height-percent:0;mso-wrap-distance-left:9pt;mso-wrap-distance-top:3.6pt;mso-wrap-distance-right:9pt;mso-wrap-distance-bottom:3.6pt;mso-position-horizontal:absolute;mso-position-horizontal-relative:text;mso-position-vertical:absolute;mso-position-vertical-relative:text;mso-width-percent:0;mso-height-percent:0;mso-width-relative:margin;mso-height-relative:margin;v-text-anchor:top" o:gfxdata="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" stroked="f">
+                <v:textbox>
+                  <w:txbxContent>
+                    <w:p>
+                      <w:r>
+                        <w:t xml:space="preserve">Subject: </w:t>
+                      </w:r>
+                      <w:proofErr w:type="gramStart"/>
+                      <w:r>
+                        <w:t xml:space="preserve">{{ </w:t>
+                      </w:r>
+                      <w:r>
+                        <w:rPr>
+                          <w:b/>
+                          <w:bCs/>
+                        </w:rPr>
+                        <w:t>exam</w:t>
+                      </w:r>
+                      <w:proofErr w:type="gramEnd"/>
+                      <w:r>
+                        <w:rPr>
+                          <w:b/>
+                          <w:bCs/>
+                        </w:rPr>
+                        <w:t>_title</w:t>
+                      </w:r>
+                      <w:r>
+                        <w:t xml:space="preserve"> }}</w:t>
+                      </w:r>
+                      <w:r>
+                        <w:br/>
+                        <w:t xml:space="preserve">Date: </w:t>
+                      </w:r>
+                      <w:proofErr w:type="gramStart"/>
+                      <w:r>
+                        <w:t xml:space="preserve">{{ </w:t>
+                      </w:r>
+                      <w:r>
+                        <w:t>exam</w:t>
+                      </w:r>
+                      <w:proofErr w:type="gramEnd"/>
+                      <w:r>
+                        <w:t>_date</w:t>
+                      </w:r>
+                      <w:r>
+                        <w:t>}}</w:t>
+                      </w:r>
+                      <w:r>
+                        <w:br/>
+                        <w:t xml:space="preserve">Number of Questions: </w:t>
+                      </w:r>
+                      <w:proofErr w:type="gramStart"/>
+                      <w:r>
+                        <w:t xml:space="preserve">{{ </w:t>
+                      </w:r>
+                      <w:r>
+                        <w:rPr>
+                          <w:b/>
+                          <w:bCs/>
+                        </w:rPr>
+                        <w:t>num</w:t>
+                      </w:r>
+                      <w:proofErr w:type="gramEnd"/>
+                      <w:r>
+                        <w:rPr>
+                          <w:b/>
+                          <w:bCs/>
+                        </w:rPr>
+                        <w:t>_questions</w:t>
+                      </w:r>
+                      <w:r>
+                        <w:t xml:space="preserve"> }}</w:t>
+                      </w:r>
+                      <w:r>
+                        <w:rPr>
+                          <w:rtl/>
+                        </w:rPr>
+                        <w:br/>
+                      </w:r>
+                      <w:r>
+                        <w:t xml:space="preserve">Teacher: </w:t>
+                      </w:r>
+                      <w:proofErr w:type="gramStart"/>
+                      <w:r>
+                        <w:t xml:space="preserve">{{ </w:t>
+                      </w:r>
+                      <w:r>
+                        <w:t>teacher</w:t>
+                      </w:r>
+                      <w:proofErr w:type="gramEnd"/>
+                      <w:r>
+                        <w:t>_name</w:t>
+                      </w:r>
+                    </w:p>
+                    <w:p>
+                      <w:r>
+                        <w:t>}}</w:t>
+                      </w:r>
+                    </w:p>
+                  </w:txbxContent>
+                </v:textbox>
+                <w10:wrap type="square"/>
+              </v:shape>
+            </w:pict>
+          </mc:Fallback>
+        </mc:AlternateContent>
+      </w:r>
+      <w:r>
+        <w:rPr>
+          <w:noProof/>
+        </w:rPr>
+        <mc:AlternateContent>
+          <mc:Choice Requires="wps">
+            <w:drawing>
+              <wp:anchor distT="45720" distB="45720" distL="114300" distR="114300" simplePos="0" relativeHeight="251663360" behindDoc="0" locked="0" layoutInCell="1" allowOverlap="1" wp14:anchorId="29DB311B" wp14:editId="03F855CF">
+                <wp:simplePos x="0" y="0"/>
+                <wp:positionH relativeFrom="margin">
+                  <wp:posOffset>4907280</wp:posOffset>
+                </wp:positionH>
+                <wp:positionV relativeFrom="paragraph">
+                  <wp:posOffset>3810</wp:posOffset>
+                </wp:positionV>
+                <wp:extent cx="2110740" cy="1059180"/>
+                <wp:effectExtent l="0" t="0" r="3810" b="7620"/>
+                <wp:wrapSquare wrapText="bothSides"/>
+                <wp:docPr id="1209906503" name="Text Box 2"/>
+                <wp:cNvGraphicFramePr>
+                  <a:graphicFrameLocks xmlns:a="http://schemas.openxmlformats.org/drawingml/2006/main"/>
+                </wp:cNvGraphicFramePr>
+                <a:graphic xmlns:a="http://schemas.openxmlformats.org/drawingml/2006/main">
+                  <a:graphicData uri="http://schemas.microsoft.com/office/word/2010/wordprocessingShape">
+                    <wps:wsp>
+                      <wps:cNvSpPr txBox="1">
+                        <a:spLocks noChangeArrowheads="1"/>
+                      </wps:cNvSpPr>
+                      <wps:spPr bwMode="auto">
+                        <a:xfrm>
+                          <a:off x="0" y="0"/>
+                          <a:ext cx="2110740" cy="1059180"/>
+                        </a:xfrm>
+                        <a:prstGeom prst="rect">
+                          <a:avLst/>
+                        </a:prstGeom>
+                        <a:solidFill>
+                          <a:srgbClr val="FFFFFF"/>
+                        </a:solidFill>
+                        <a:ln w="9525">
+                          <a:noFill/>
+                          <a:miter lim="800000"/>
+                          <a:headEnd/>
+                          <a:tailEnd/>
+                        </a:ln>
+                      </wps:spPr>
+                      <wps:txbx>
+                        <w:txbxContent>
+                          <w:p>
+                            <w:pPr>
+                              <w:spacing w:after="0" w:line="240" w:lineRule="auto"/>
+                              <w:rPr>
+                                <w:b/>
+                                <w:bCs/>
+                                <w:lang w:bidi="ar-YE"/>
+                              </w:rPr>
+                            </w:pPr>
+                            <w:r>
+                              <w:rPr>
+                                <w:b/>
+                                <w:bCs/>
+                                <w:lang w:bidi="ar-YE"/>
+                              </w:rPr>
+                              <w:t>Republic of Yemen</w:t>
+                            </w:r>
+                          </w:p>
+                          <w:p>
+                            <w:pPr>
+                              <w:spacing w:after="0" w:line="240" w:lineRule="auto"/>
+                              <w:rPr>
+                                <w:b/>
+                                <w:bCs/>
+                                <w:rtl/>
+                                <w:lang w:bidi="ar-YE"/>
+                              </w:rPr>
+                            </w:pPr>
+                            <w:r>
+                              <w:rPr>
+                                <w:b/>
+                                <w:bCs/>
+                                <w:lang w:bidi="ar-YE"/>
+                              </w:rPr>
+                              <w:t>Ministry of Education</w:t>
+                            </w:r>
+                            <w:r>
+                              <w:rPr>
+                                <w:b/>
+                                <w:bCs/>
+                                <w:rtl/>
+                                <w:lang w:bidi="ar-YE"/>
+                              </w:rPr>
+                              <w:br/>
+                            </w:r>
+                            <w:r>
+                              <w:rPr>
+                                <w:b/>
+                                <w:bCs/>
+                                <w:lang w:bidi="ar-YE"/>
+                              </w:rPr>
+                              <w:t>University of Saba Region</w:t>
+                            </w:r>
+                          </w:p>
+                        </w:txbxContent>
+                      </wps:txbx>
+                      <wps:bodyPr rot="0" vert="horz" wrap="square" lIns="91440" tIns="45720" rIns="91440" bIns="45720" anchor="t" anchorCtr="0">
+                        <a:noAutofit/>
+                      </wps:bodyPr>
+                    </wps:wsp>
+                  </a:graphicData>
+                </a:graphic>
+                <wp14:sizeRelH relativeFrom="margin">
+                  <wp14:pctWidth>0</wp14:pctWidth>
+                </wp14:sizeRelH>
+                <wp14:sizeRelV relativeFrom="margin">
+                  <wp14:pctHeight>0</wp14:pctHeight>
+                </wp14:sizeRelV>
+              </wp:anchor>
+            </w:drawing>
+          </mc:Choice>
+          <mc:Fallback>
+            <w:pict>
+              <v:shape w14:anchorId="29DB311B" id="_x0000_s1028" type="#_x0000_t202" style="position:absolute;margin-left:386.4pt;margin-top:.3pt;width:166.2pt;height:83.4pt;z-index:251663360;visibility:visible;mso-wrap-style:square;mso-width-percent:0;mso-height-percent:0;mso-wrap-distance-left:9pt;mso-wrap-distance-top:3.6pt;mso-wrap-distance-right:9pt;mso-wrap-distance-bottom:3.6pt;mso-position-horizontal:absolute;mso-position-horizontal-relative:margin;mso-position-vertical:absolute;mso-position-vertical-relative:text;mso-width-percent:0;mso-height-percent:0;mso-width-relative:margin;mso-height-relative:margin;v-text-anchor:top" o:gfxdata="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" stroked="f">
+                <v:textbox>
+                  <w:txbxContent>
+                    <w:p>
+                      <w:pPr>
+                        <w:spacing w:after="0" w:line="240" w:lineRule="auto"/>
+                        <w:rPr>
+                          <w:b/>
+                          <w:bCs/>
+                          <w:lang w:bidi="ar-YE"/>
+                        </w:rPr>
+                      </w:pPr>
+                      <w:r>
+                        <w:rPr>
+                          <w:b/>
+                          <w:bCs/>
+                          <w:lang w:bidi="ar-YE"/>
+                        </w:rPr>
+                        <w:t>Republic of Yemen</w:t>
+                      </w:r>
+                    </w:p>
+                    <w:p>
+                      <w:pPr>
+                        <w:spacing w:after="0" w:line="240" w:lineRule="auto"/>
+                        <w:rPr>
+                          <w:b/>
+                          <w:bCs/>
+                          <w:rtl/>
+                          <w:lang w:bidi="ar-YE"/>
+                        </w:rPr>
+                      </w:pPr>
+                      <w:r>
+                        <w:rPr>
+                          <w:b/>
+                          <w:bCs/>
+                          <w:lang w:bidi="ar-YE"/>
+                        </w:rPr>
+                        <w:t>Ministry of Education</w:t>
+                      </w:r>
+                      <w:r>
+                        <w:rPr>
+                          <w:b/>
+                          <w:bCs/>
+                          <w:rtl/>
+                          <w:lang w:bidi="ar-YE"/>
+                        </w:rPr>
+                        <w:br/>
+                      </w:r>
+                      <w:r>
+                        <w:rPr>
+                          <w:b/>
+                          <w:bCs/>
+                          <w:lang w:bidi="ar-YE"/>
+                        </w:rPr>
+                        <w:t>University of Saba Region</w:t>
                       </w:r>
                     </w:p>
                   </w:txbxContent>
@@ -886,11 +904,7 @@
       </w:r>
       <w:proofErr w:type="gramStart"/>
       <w:r>
-        <w:t xml:space="preserve">{{ </w:t>
-      </w:r>
-      <w:proofErr w:type="spellStart"/>
-      <w:r>
-        <w:t>loop</w:t>
+        <w:t>{{ loop</w:t>
       </w:r>
       <w:proofErr w:type="gramEnd"/>
       <w:r>
@@ -898,11 +912,7 @@
       </w:r>
       <w:proofErr w:type="gramStart"/>
       <w:r>
-        <w:t>index</w:t>
-      </w:r>
-      <w:proofErr w:type="spellEnd"/>
-      <w:r>
-        <w:t xml:space="preserve"> }</w:t>
+        <w:t>index }</w:t>
       </w:r>
       <w:proofErr w:type="gramEnd"/>
       <w:r>
@@ -910,11 +920,7 @@
       </w:r>
       <w:proofErr w:type="gramStart"/>
       <w:r>
-        <w:t xml:space="preserve">{{ </w:t>
-      </w:r>
-      <w:proofErr w:type="spellStart"/>
-      <w:r>
-        <w:t>q</w:t>
+        <w:t>{{ q</w:t>
       </w:r>
       <w:proofErr w:type="gramEnd"/>
       <w:r>
@@ -922,11 +928,7 @@
       </w:r>
       <w:proofErr w:type="gramStart"/>
       <w:r>
-        <w:t>question</w:t>
-      </w:r>
-      <w:proofErr w:type="spellEnd"/>
-      <w:r>
-        <w:t xml:space="preserve"> }</w:t>
+        <w:t>question }</w:t>
       </w:r>
       <w:proofErr w:type="gramEnd"/>
       <w:r>
@@ -951,21 +953,14 @@
       <w:r>
         <w:t xml:space="preserve">{% if </w:t>
       </w:r>
-      <w:proofErr w:type="spellStart"/>
       <w:proofErr w:type="gramStart"/>
       <w:r>
         <w:t>q.type</w:t>
       </w:r>
-      <w:proofErr w:type="spellEnd"/>
       <w:proofErr w:type="gramEnd"/>
       <w:r>
-        <w:t xml:space="preserve"> == '</w:t>
-      </w:r>
-      <w:proofErr w:type="spellStart"/>
-      <w:r>
-        <w:t>mcq</w:t>
-      </w:r>
-      <w:proofErr w:type="spellEnd"/>
+        <w:t xml:space="preserve"> == 'mcq</w:t>
+      </w:r>
       <w:proofErr w:type="gramStart"/>
       <w:r>
         <w:t>' %}</w:t>
@@ -979,12 +974,10 @@
       <w:r>
         <w:t xml:space="preserve">{% for opt in </w:t>
       </w:r>
-      <w:proofErr w:type="spellStart"/>
       <w:proofErr w:type="gramStart"/>
       <w:r>
         <w:t>q.options</w:t>
       </w:r>
-      <w:proofErr w:type="spellEnd"/>
       <w:proofErr w:type="gramEnd"/>
       <w:r>
         <w:t xml:space="preserve"> %}</w:t>
@@ -994,11 +987,7 @@
       </w:r>
       <w:proofErr w:type="gramStart"/>
       <w:r>
-        <w:t xml:space="preserve">{{ </w:t>
-      </w:r>
-      <w:proofErr w:type="spellStart"/>
-      <w:r>
-        <w:t>loop</w:t>
+        <w:t>{{ loop</w:t>
       </w:r>
       <w:proofErr w:type="gramEnd"/>
       <w:r>
@@ -1006,11 +995,7 @@
       </w:r>
       <w:proofErr w:type="gramStart"/>
       <w:r>
-        <w:t>index</w:t>
-      </w:r>
-      <w:proofErr w:type="spellEnd"/>
-      <w:r>
-        <w:t xml:space="preserve"> }</w:t>
+        <w:t>index }</w:t>
       </w:r>
       <w:proofErr w:type="gramEnd"/>
       <w:r>
@@ -1039,15 +1024,7 @@
         </w:rPr>
       </w:pPr>
       <w:r>
-        <w:t xml:space="preserve">{% </w:t>
-      </w:r>
-      <w:proofErr w:type="spellStart"/>
-      <w:r>
-        <w:t>endfor</w:t>
-      </w:r>
-      <w:proofErr w:type="spellEnd"/>
-      <w:r>
-        <w:t xml:space="preserve"> %}</w:t>
+        <w:t>{% endfor %}</w:t>
       </w:r>
     </w:p>
     <w:p>
@@ -1058,33 +1035,15 @@
         </w:rPr>
       </w:pPr>
       <w:r>
-        <w:t xml:space="preserve">{% </w:t>
-      </w:r>
-      <w:proofErr w:type="spellStart"/>
-      <w:r>
-        <w:t>elif</w:t>
-      </w:r>
-      <w:proofErr w:type="spellEnd"/>
-      <w:r>
-        <w:t xml:space="preserve"> </w:t>
-      </w:r>
-      <w:proofErr w:type="spellStart"/>
+        <w:t xml:space="preserve">{% elif </w:t>
+      </w:r>
       <w:proofErr w:type="gramStart"/>
       <w:r>
         <w:t>q.type</w:t>
       </w:r>
-      <w:proofErr w:type="spellEnd"/>
       <w:proofErr w:type="gramEnd"/>
       <w:r>
-        <w:t xml:space="preserve"> == '</w:t>
-      </w:r>
-      <w:proofErr w:type="spellStart"/>
-      <w:r>
-        <w:t>tf</w:t>
-      </w:r>
-      <w:proofErr w:type="spellEnd"/>
-      <w:r>
-        <w:t xml:space="preserve">' </w:t>
+        <w:t xml:space="preserve"> == 'tf' </w:t>
       </w:r>
       <w:proofErr w:type="gramStart"/>
       <w:r>
@@ -1138,19 +1097,11 @@
         </w:rPr>
       </w:pPr>
       <w:r>
-        <w:t xml:space="preserve">{% if </w:t>
-      </w:r>
-      <w:proofErr w:type="spellStart"/>
-      <w:r>
-        <w:t>show_</w:t>
+        <w:t>{% if show_</w:t>
       </w:r>
       <w:proofErr w:type="gramStart"/>
       <w:r>
-        <w:t>answers</w:t>
-      </w:r>
-      <w:proofErr w:type="spellEnd"/>
-      <w:r>
-        <w:t xml:space="preserve"> %}</w:t>
+        <w:t>answers %}</w:t>
       </w:r>
       <w:proofErr w:type="gramEnd"/>
     </w:p>
@@ -1166,11 +1117,7 @@
       </w:r>
       <w:proofErr w:type="gramStart"/>
       <w:r>
-        <w:t xml:space="preserve">{{ </w:t>
-      </w:r>
-      <w:proofErr w:type="spellStart"/>
-      <w:r>
-        <w:t>q</w:t>
+        <w:t>{{ q</w:t>
       </w:r>
       <w:proofErr w:type="gramEnd"/>
       <w:r>
@@ -1178,11 +1125,7 @@
       </w:r>
       <w:proofErr w:type="gramStart"/>
       <w:r>
-        <w:t>answer</w:t>
-      </w:r>
-      <w:proofErr w:type="spellEnd"/>
-      <w:r>
-        <w:t xml:space="preserve"> }</w:t>
+        <w:t>answer }</w:t>
       </w:r>
       <w:proofErr w:type="gramEnd"/>
       <w:r>
@@ -1205,15 +1148,7 @@
         <w:spacing w:after="0"/>
       </w:pPr>
       <w:r>
-        <w:t xml:space="preserve">{% </w:t>
-      </w:r>
-      <w:proofErr w:type="spellStart"/>
-      <w:r>
-        <w:t>endfor</w:t>
-      </w:r>
-      <w:proofErr w:type="spellEnd"/>
-      <w:r>
-        <w:t xml:space="preserve"> %}</w:t>
+        <w:t>{% endfor %}</w:t>
       </w:r>
     </w:p>
     <w:p>
@@ -1893,7 +1828,6 @@
   <w:style w:type="character" w:default="1" w:styleId="DefaultParagraphFont">
     <w:name w:val="Default Paragraph Font"/>
     <w:uiPriority w:val="1"/>
-    <w:semiHidden/>
     <w:unhideWhenUsed/>
   </w:style>
   <w:style w:type="table" w:default="1" w:styleId="TableNormal">

</xml_diff>

<commit_message>
add option for uploading logo
</commit_message>
<xml_diff>
--- a/templates_files/exam_template.docx
+++ b/templates_files/exam_template.docx
@@ -10,18 +10,18 @@
         <mc:AlternateContent>
           <mc:Choice Requires="wps">
             <w:drawing>
-              <wp:anchor distT="45720" distB="45720" distL="114300" distR="114300" simplePos="0" relativeHeight="251659264" behindDoc="0" locked="0" layoutInCell="1" allowOverlap="1" wp14:anchorId="44E98699" wp14:editId="2D77F5F1">
+              <wp:anchor distT="45720" distB="45720" distL="114300" distR="114300" simplePos="0" relativeHeight="251661312" behindDoc="0" locked="0" layoutInCell="1" allowOverlap="1" wp14:anchorId="2CAEC779" wp14:editId="66F9F560">
                 <wp:simplePos x="0" y="0"/>
-                <wp:positionH relativeFrom="margin">
-                  <wp:posOffset>3129915</wp:posOffset>
+                <wp:positionH relativeFrom="column">
+                  <wp:posOffset>-99060</wp:posOffset>
                 </wp:positionH>
                 <wp:positionV relativeFrom="paragraph">
                   <wp:posOffset>3810</wp:posOffset>
                 </wp:positionV>
-                <wp:extent cx="1074420" cy="876300"/>
-                <wp:effectExtent l="0" t="0" r="0" b="0"/>
+                <wp:extent cx="3009900" cy="986790"/>
+                <wp:effectExtent l="0" t="0" r="0" b="3810"/>
                 <wp:wrapSquare wrapText="bothSides"/>
-                <wp:docPr id="217" name="Text Box 2"/>
+                <wp:docPr id="1466583984" name="Text Box 2"/>
                 <wp:cNvGraphicFramePr>
                   <a:graphicFrameLocks xmlns:a="http://schemas.openxmlformats.org/drawingml/2006/main"/>
                 </wp:cNvGraphicFramePr>
@@ -34,7 +34,7 @@
                       <wps:spPr bwMode="auto">
                         <a:xfrm>
                           <a:off x="0" y="0"/>
-                          <a:ext cx="1074420" cy="876300"/>
+                          <a:ext cx="3009900" cy="986790"/>
                         </a:xfrm>
                         <a:prstGeom prst="rect">
                           <a:avLst/>
@@ -52,204 +52,6 @@
                       <wps:txbx>
                         <w:txbxContent>
                           <w:p>
-                            <w:pPr>
-                              <w:jc w:val="center"/>
-                            </w:pPr>
-                            <w:r>
-                              <w:rPr>
-                                <w:noProof/>
-                              </w:rPr>
-                              <w:drawing>
-                                <wp:inline distT="0" distB="0" distL="0" distR="0" wp14:anchorId="30D4D868" wp14:editId="5BE964CF">
-                                  <wp:extent cx="712470" cy="765810"/>
-                                  <wp:effectExtent l="0" t="0" r="0" b="0"/>
-                                  <wp:docPr id="18" name="Picture 1"/>
-                                  <wp:cNvGraphicFramePr>
-                                    <a:graphicFrameLocks xmlns:a="http://schemas.openxmlformats.org/drawingml/2006/main" noChangeAspect="1"/>
-                                  </wp:cNvGraphicFramePr>
-                                  <a:graphic xmlns:a="http://schemas.openxmlformats.org/drawingml/2006/main">
-                                    <a:graphicData uri="http://schemas.openxmlformats.org/drawingml/2006/picture">
-                                      <pic:pic xmlns:pic="http://schemas.openxmlformats.org/drawingml/2006/picture">
-                                        <pic:nvPicPr>
-                                          <pic:cNvPr id="18" name="Picture 18"/>
-                                          <pic:cNvPicPr>
-                                            <a:picLocks noChangeAspect="1"/>
-                                          </pic:cNvPicPr>
-                                        </pic:nvPicPr>
-                                        <pic:blipFill>
-                                          <a:blip r:embed="rId7">
-                                            <a:extLst>
-                                              <a:ext uri="{28A0092B-C50C-407E-A947-70E740481C1C}">
-                                                <a14:useLocalDpi xmlns:a14="http://schemas.microsoft.com/office/drawing/2010/main" val="0"/>
-                                              </a:ext>
-                                            </a:extLst>
-                                          </a:blip>
-                                          <a:srcRect/>
-                                          <a:stretch>
-                                            <a:fillRect/>
-                                          </a:stretch>
-                                        </pic:blipFill>
-                                        <pic:spPr bwMode="auto">
-                                          <a:xfrm>
-                                            <a:off x="0" y="0"/>
-                                            <a:ext cx="712470" cy="765810"/>
-                                          </a:xfrm>
-                                          <a:prstGeom prst="rect">
-                                            <a:avLst/>
-                                          </a:prstGeom>
-                                          <a:noFill/>
-                                          <a:ln>
-                                            <a:noFill/>
-                                          </a:ln>
-                                        </pic:spPr>
-                                      </pic:pic>
-                                    </a:graphicData>
-                                  </a:graphic>
-                                </wp:inline>
-                              </w:drawing>
-                            </w:r>
-                          </w:p>
-                        </w:txbxContent>
-                      </wps:txbx>
-                      <wps:bodyPr rot="0" vert="horz" wrap="square" lIns="91440" tIns="45720" rIns="91440" bIns="45720" anchor="t" anchorCtr="0">
-                        <a:noAutofit/>
-                      </wps:bodyPr>
-                    </wps:wsp>
-                  </a:graphicData>
-                </a:graphic>
-                <wp14:sizeRelH relativeFrom="margin">
-                  <wp14:pctWidth>0</wp14:pctWidth>
-                </wp14:sizeRelH>
-                <wp14:sizeRelV relativeFrom="margin">
-                  <wp14:pctHeight>0</wp14:pctHeight>
-                </wp14:sizeRelV>
-              </wp:anchor>
-            </w:drawing>
-          </mc:Choice>
-          <mc:Fallback>
-            <w:pict>
-              <v:shapetype w14:anchorId="44E98699" id="_x0000_t202" coordsize="21600,21600" o:spt="202" path="m,l,21600r21600,l21600,xe">
-                <v:stroke joinstyle="miter"/>
-                <v:path gradientshapeok="t" o:connecttype="rect"/>
-              </v:shapetype>
-              <v:shape id="Text Box 2" o:spid="_x0000_s1026" type="#_x0000_t202" style="position:absolute;margin-left:246.45pt;margin-top:.3pt;width:84.6pt;height:69pt;z-index:251659264;visibility:visible;mso-wrap-style:square;mso-width-percent:0;mso-height-percent:0;mso-wrap-distance-left:9pt;mso-wrap-distance-top:3.6pt;mso-wrap-distance-right:9pt;mso-wrap-distance-bottom:3.6pt;mso-position-horizontal:absolute;mso-position-horizontal-relative:margin;mso-position-vertical:absolute;mso-position-vertical-relative:text;mso-width-percent:0;mso-height-percent:0;mso-width-relative:margin;mso-height-relative:margin;v-text-anchor:top" o:gfxdata="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" stroked="f">
-                <v:textbox>
-                  <w:txbxContent>
-                    <w:p>
-                      <w:pPr>
-                        <w:jc w:val="center"/>
-                      </w:pPr>
-                      <w:r>
-                        <w:rPr>
-                          <w:noProof/>
-                        </w:rPr>
-                        <w:drawing>
-                          <wp:inline distT="0" distB="0" distL="0" distR="0" wp14:anchorId="30D4D868" wp14:editId="5BE964CF">
-                            <wp:extent cx="712470" cy="765810"/>
-                            <wp:effectExtent l="0" t="0" r="0" b="0"/>
-                            <wp:docPr id="18" name="Picture 1"/>
-                            <wp:cNvGraphicFramePr>
-                              <a:graphicFrameLocks xmlns:a="http://schemas.openxmlformats.org/drawingml/2006/main" noChangeAspect="1"/>
-                            </wp:cNvGraphicFramePr>
-                            <a:graphic xmlns:a="http://schemas.openxmlformats.org/drawingml/2006/main">
-                              <a:graphicData uri="http://schemas.openxmlformats.org/drawingml/2006/picture">
-                                <pic:pic xmlns:pic="http://schemas.openxmlformats.org/drawingml/2006/picture">
-                                  <pic:nvPicPr>
-                                    <pic:cNvPr id="18" name="Picture 18"/>
-                                    <pic:cNvPicPr>
-                                      <a:picLocks noChangeAspect="1"/>
-                                    </pic:cNvPicPr>
-                                  </pic:nvPicPr>
-                                  <pic:blipFill>
-                                    <a:blip r:embed="rId8">
-                                      <a:extLst>
-                                        <a:ext uri="{28A0092B-C50C-407E-A947-70E740481C1C}">
-                                          <a14:useLocalDpi xmlns:a14="http://schemas.microsoft.com/office/drawing/2010/main" val="0"/>
-                                        </a:ext>
-                                      </a:extLst>
-                                    </a:blip>
-                                    <a:srcRect/>
-                                    <a:stretch>
-                                      <a:fillRect/>
-                                    </a:stretch>
-                                  </pic:blipFill>
-                                  <pic:spPr bwMode="auto">
-                                    <a:xfrm>
-                                      <a:off x="0" y="0"/>
-                                      <a:ext cx="712470" cy="765810"/>
-                                    </a:xfrm>
-                                    <a:prstGeom prst="rect">
-                                      <a:avLst/>
-                                    </a:prstGeom>
-                                    <a:noFill/>
-                                    <a:ln>
-                                      <a:noFill/>
-                                    </a:ln>
-                                  </pic:spPr>
-                                </pic:pic>
-                              </a:graphicData>
-                            </a:graphic>
-                          </wp:inline>
-                        </w:drawing>
-                      </w:r>
-                    </w:p>
-                  </w:txbxContent>
-                </v:textbox>
-                <w10:wrap type="square" anchorx="margin"/>
-              </v:shape>
-            </w:pict>
-          </mc:Fallback>
-        </mc:AlternateContent>
-      </w:r>
-      <w:r>
-        <w:rPr>
-          <w:noProof/>
-        </w:rPr>
-        <mc:AlternateContent>
-          <mc:Choice Requires="wps">
-            <w:drawing>
-              <wp:anchor distT="45720" distB="45720" distL="114300" distR="114300" simplePos="0" relativeHeight="251661312" behindDoc="0" locked="0" layoutInCell="1" allowOverlap="1" wp14:anchorId="2CAEC779" wp14:editId="29FE1EEE">
-                <wp:simplePos x="0" y="0"/>
-                <wp:positionH relativeFrom="column">
-                  <wp:posOffset>-98425</wp:posOffset>
-                </wp:positionH>
-                <wp:positionV relativeFrom="paragraph">
-                  <wp:posOffset>5080</wp:posOffset>
-                </wp:positionV>
-                <wp:extent cx="3009900" cy="941070"/>
-                <wp:effectExtent l="0" t="0" r="0" b="0"/>
-                <wp:wrapSquare wrapText="bothSides"/>
-                <wp:docPr id="1466583984" name="Text Box 2"/>
-                <wp:cNvGraphicFramePr>
-                  <a:graphicFrameLocks xmlns:a="http://schemas.openxmlformats.org/drawingml/2006/main"/>
-                </wp:cNvGraphicFramePr>
-                <a:graphic xmlns:a="http://schemas.openxmlformats.org/drawingml/2006/main">
-                  <a:graphicData uri="http://schemas.microsoft.com/office/word/2010/wordprocessingShape">
-                    <wps:wsp>
-                      <wps:cNvSpPr txBox="1">
-                        <a:spLocks noChangeArrowheads="1"/>
-                      </wps:cNvSpPr>
-                      <wps:spPr bwMode="auto">
-                        <a:xfrm>
-                          <a:off x="0" y="0"/>
-                          <a:ext cx="3009900" cy="941070"/>
-                        </a:xfrm>
-                        <a:prstGeom prst="rect">
-                          <a:avLst/>
-                        </a:prstGeom>
-                        <a:solidFill>
-                          <a:srgbClr val="FFFFFF"/>
-                        </a:solidFill>
-                        <a:ln w="9525">
-                          <a:noFill/>
-                          <a:miter lim="800000"/>
-                          <a:headEnd/>
-                          <a:tailEnd/>
-                        </a:ln>
-                      </wps:spPr>
-                      <wps:txbx>
-                        <w:txbxContent>
-                          <w:p>
                             <w:r>
                               <w:t xml:space="preserve">Subject: </w:t>
                             </w:r>
@@ -257,6 +59,7 @@
                             <w:r>
                               <w:t xml:space="preserve">{{ </w:t>
                             </w:r>
+                            <w:proofErr w:type="spellStart"/>
                             <w:r>
                               <w:rPr>
                                 <w:b/>
@@ -272,6 +75,7 @@
                               </w:rPr>
                               <w:t>_title</w:t>
                             </w:r>
+                            <w:proofErr w:type="spellEnd"/>
                             <w:r>
                               <w:t xml:space="preserve"> }}</w:t>
                             </w:r>
@@ -283,6 +87,7 @@
                             <w:r>
                               <w:t xml:space="preserve">{{ </w:t>
                             </w:r>
+                            <w:proofErr w:type="spellStart"/>
                             <w:r>
                               <w:t>exam</w:t>
                             </w:r>
@@ -290,6 +95,7 @@
                             <w:r>
                               <w:t>_date</w:t>
                             </w:r>
+                            <w:proofErr w:type="spellEnd"/>
                             <w:r>
                               <w:t>}}</w:t>
                             </w:r>
@@ -301,6 +107,7 @@
                             <w:r>
                               <w:t xml:space="preserve">{{ </w:t>
                             </w:r>
+                            <w:proofErr w:type="spellStart"/>
                             <w:r>
                               <w:rPr>
                                 <w:b/>
@@ -316,6 +123,7 @@
                               </w:rPr>
                               <w:t>_questions</w:t>
                             </w:r>
+                            <w:proofErr w:type="spellEnd"/>
                             <w:r>
                               <w:t xml:space="preserve"> }}</w:t>
                             </w:r>
@@ -332,17 +140,37 @@
                             <w:r>
                               <w:t xml:space="preserve">{{ </w:t>
                             </w:r>
-                            <w:r>
+                            <w:proofErr w:type="spellStart"/>
+                            <w:r>
+                              <w:rPr>
+                                <w:b/>
+                                <w:bCs/>
+                              </w:rPr>
                               <w:t>teacher</w:t>
                             </w:r>
                             <w:proofErr w:type="gramEnd"/>
                             <w:r>
-                              <w:t>_name</w:t>
-                            </w:r>
-                          </w:p>
-                          <w:p>
-                            <w:r>
-                              <w:t>}}</w:t>
+                              <w:rPr>
+                                <w:b/>
+                                <w:bCs/>
+                              </w:rPr>
+                              <w:t>_</w:t>
+                            </w:r>
+                            <w:proofErr w:type="gramStart"/>
+                            <w:r>
+                              <w:rPr>
+                                <w:b/>
+                                <w:bCs/>
+                              </w:rPr>
+                              <w:t>name</w:t>
+                            </w:r>
+                            <w:proofErr w:type="spellEnd"/>
+                            <w:r>
+                              <w:t xml:space="preserve"> }</w:t>
+                            </w:r>
+                            <w:proofErr w:type="gramEnd"/>
+                            <w:r>
+                              <w:t>}</w:t>
                             </w:r>
                           </w:p>
                         </w:txbxContent>
@@ -368,7 +196,7 @@
                 <v:stroke joinstyle="miter"/>
                 <v:path gradientshapeok="t" o:connecttype="rect"/>
               </v:shapetype>
-              <v:shape id="_x0000_s1027" type="#_x0000_t202" style="position:absolute;margin-left:-7.75pt;margin-top:.4pt;width:237pt;height:74.1pt;z-index:251661312;visibility:visible;mso-wrap-style:square;mso-width-percent:0;mso-height-percent:0;mso-wrap-distance-left:9pt;mso-wrap-distance-top:3.6pt;mso-wrap-distance-right:9pt;mso-wrap-distance-bottom:3.6pt;mso-position-horizontal:absolute;mso-position-horizontal-relative:text;mso-position-vertical:absolute;mso-position-vertical-relative:text;mso-width-percent:0;mso-height-percent:0;mso-width-relative:margin;mso-height-relative:margin;v-text-anchor:top" o:gfxdata="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" stroked="f">
+              <v:shape id="Text Box 2" o:spid="_x0000_s1026" type="#_x0000_t202" style="position:absolute;margin-left:-7.8pt;margin-top:.3pt;width:237pt;height:77.7pt;z-index:251661312;visibility:visible;mso-wrap-style:square;mso-width-percent:0;mso-height-percent:0;mso-wrap-distance-left:9pt;mso-wrap-distance-top:3.6pt;mso-wrap-distance-right:9pt;mso-wrap-distance-bottom:3.6pt;mso-position-horizontal:absolute;mso-position-horizontal-relative:text;mso-position-vertical:absolute;mso-position-vertical-relative:text;mso-width-percent:0;mso-height-percent:0;mso-width-relative:margin;mso-height-relative:margin;v-text-anchor:top" o:gfxdata="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" stroked="f">
                 <v:textbox>
                   <w:txbxContent>
                     <w:p>
@@ -379,6 +207,7 @@
                       <w:r>
                         <w:t xml:space="preserve">{{ </w:t>
                       </w:r>
+                      <w:proofErr w:type="spellStart"/>
                       <w:r>
                         <w:rPr>
                           <w:b/>
@@ -394,6 +223,7 @@
                         </w:rPr>
                         <w:t>_title</w:t>
                       </w:r>
+                      <w:proofErr w:type="spellEnd"/>
                       <w:r>
                         <w:t xml:space="preserve"> }}</w:t>
                       </w:r>
@@ -405,6 +235,7 @@
                       <w:r>
                         <w:t xml:space="preserve">{{ </w:t>
                       </w:r>
+                      <w:proofErr w:type="spellStart"/>
                       <w:r>
                         <w:t>exam</w:t>
                       </w:r>
@@ -412,6 +243,7 @@
                       <w:r>
                         <w:t>_date</w:t>
                       </w:r>
+                      <w:proofErr w:type="spellEnd"/>
                       <w:r>
                         <w:t>}}</w:t>
                       </w:r>
@@ -423,6 +255,7 @@
                       <w:r>
                         <w:t xml:space="preserve">{{ </w:t>
                       </w:r>
+                      <w:proofErr w:type="spellStart"/>
                       <w:r>
                         <w:rPr>
                           <w:b/>
@@ -438,6 +271,7 @@
                         </w:rPr>
                         <w:t>_questions</w:t>
                       </w:r>
+                      <w:proofErr w:type="spellEnd"/>
                       <w:r>
                         <w:t xml:space="preserve"> }}</w:t>
                       </w:r>
@@ -454,22 +288,188 @@
                       <w:r>
                         <w:t xml:space="preserve">{{ </w:t>
                       </w:r>
-                      <w:r>
+                      <w:proofErr w:type="spellStart"/>
+                      <w:r>
+                        <w:rPr>
+                          <w:b/>
+                          <w:bCs/>
+                        </w:rPr>
                         <w:t>teacher</w:t>
                       </w:r>
                       <w:proofErr w:type="gramEnd"/>
                       <w:r>
-                        <w:t>_name</w:t>
-                      </w:r>
-                    </w:p>
-                    <w:p>
-                      <w:r>
-                        <w:t>}}</w:t>
+                        <w:rPr>
+                          <w:b/>
+                          <w:bCs/>
+                        </w:rPr>
+                        <w:t>_</w:t>
+                      </w:r>
+                      <w:proofErr w:type="gramStart"/>
+                      <w:r>
+                        <w:rPr>
+                          <w:b/>
+                          <w:bCs/>
+                        </w:rPr>
+                        <w:t>name</w:t>
+                      </w:r>
+                      <w:proofErr w:type="spellEnd"/>
+                      <w:r>
+                        <w:t xml:space="preserve"> }</w:t>
+                      </w:r>
+                      <w:proofErr w:type="gramEnd"/>
+                      <w:r>
+                        <w:t>}</w:t>
                       </w:r>
                     </w:p>
                   </w:txbxContent>
                 </v:textbox>
                 <w10:wrap type="square"/>
+              </v:shape>
+            </w:pict>
+          </mc:Fallback>
+        </mc:AlternateContent>
+      </w:r>
+      <w:r>
+        <w:rPr>
+          <w:noProof/>
+        </w:rPr>
+        <mc:AlternateContent>
+          <mc:Choice Requires="wps">
+            <w:drawing>
+              <wp:anchor distT="45720" distB="45720" distL="114300" distR="114300" simplePos="0" relativeHeight="251659264" behindDoc="0" locked="0" layoutInCell="1" allowOverlap="1" wp14:anchorId="44E98699" wp14:editId="4D3E8D2A">
+                <wp:simplePos x="0" y="0"/>
+                <wp:positionH relativeFrom="margin">
+                  <wp:posOffset>2944495</wp:posOffset>
+                </wp:positionH>
+                <wp:positionV relativeFrom="paragraph">
+                  <wp:posOffset>5080</wp:posOffset>
+                </wp:positionV>
+                <wp:extent cx="1273175" cy="876300"/>
+                <wp:effectExtent l="0" t="0" r="3175" b="0"/>
+                <wp:wrapSquare wrapText="bothSides"/>
+                <wp:docPr id="217" name="Text Box 2"/>
+                <wp:cNvGraphicFramePr>
+                  <a:graphicFrameLocks xmlns:a="http://schemas.openxmlformats.org/drawingml/2006/main"/>
+                </wp:cNvGraphicFramePr>
+                <a:graphic xmlns:a="http://schemas.openxmlformats.org/drawingml/2006/main">
+                  <a:graphicData uri="http://schemas.microsoft.com/office/word/2010/wordprocessingShape">
+                    <wps:wsp>
+                      <wps:cNvSpPr txBox="1">
+                        <a:spLocks noChangeArrowheads="1"/>
+                      </wps:cNvSpPr>
+                      <wps:spPr bwMode="auto">
+                        <a:xfrm>
+                          <a:off x="0" y="0"/>
+                          <a:ext cx="1273175" cy="876300"/>
+                        </a:xfrm>
+                        <a:prstGeom prst="rect">
+                          <a:avLst/>
+                        </a:prstGeom>
+                        <a:solidFill>
+                          <a:srgbClr val="FFFFFF"/>
+                        </a:solidFill>
+                        <a:ln w="9525">
+                          <a:noFill/>
+                          <a:miter lim="800000"/>
+                          <a:headEnd/>
+                          <a:tailEnd/>
+                        </a:ln>
+                      </wps:spPr>
+                      <wps:txbx>
+                        <w:txbxContent>
+                          <w:p>
+                            <w:pPr>
+                              <w:rPr>
+                                <w:lang w:bidi="ar-YE"/>
+                              </w:rPr>
+                            </w:pPr>
+                            <w:r>
+                              <w:rPr>
+                                <w:b/>
+                                <w:bCs/>
+                                <w:noProof/>
+                                <w:lang w:bidi="ar-YE"/>
+                              </w:rPr>
+                              <w:t>{{</w:t>
+                            </w:r>
+                            <w:r>
+                              <w:rPr>
+                                <w:b/>
+                                <w:bCs/>
+                                <w:noProof/>
+                                <w:lang w:bidi="ar-YE"/>
+                              </w:rPr>
+                              <w:t>school_log</w:t>
+                            </w:r>
+                            <w:r>
+                              <w:rPr>
+                                <w:b/>
+                                <w:bCs/>
+                                <w:noProof/>
+                                <w:lang w:bidi="ar-YE"/>
+                              </w:rPr>
+                              <w:t>o}}</w:t>
+                            </w:r>
+                          </w:p>
+                        </w:txbxContent>
+                      </wps:txbx>
+                      <wps:bodyPr rot="0" vert="horz" wrap="square" lIns="91440" tIns="45720" rIns="91440" bIns="45720" anchor="t" anchorCtr="0">
+                        <a:noAutofit/>
+                      </wps:bodyPr>
+                    </wps:wsp>
+                  </a:graphicData>
+                </a:graphic>
+                <wp14:sizeRelH relativeFrom="margin">
+                  <wp14:pctWidth>0</wp14:pctWidth>
+                </wp14:sizeRelH>
+                <wp14:sizeRelV relativeFrom="margin">
+                  <wp14:pctHeight>0</wp14:pctHeight>
+                </wp14:sizeRelV>
+              </wp:anchor>
+            </w:drawing>
+          </mc:Choice>
+          <mc:Fallback>
+            <w:pict>
+              <v:shape w14:anchorId="44E98699" id="_x0000_s1027" type="#_x0000_t202" style="position:absolute;margin-left:231.85pt;margin-top:.4pt;width:100.25pt;height:69pt;z-index:251659264;visibility:visible;mso-wrap-style:square;mso-width-percent:0;mso-height-percent:0;mso-wrap-distance-left:9pt;mso-wrap-distance-top:3.6pt;mso-wrap-distance-right:9pt;mso-wrap-distance-bottom:3.6pt;mso-position-horizontal:absolute;mso-position-horizontal-relative:margin;mso-position-vertical:absolute;mso-position-vertical-relative:text;mso-width-percent:0;mso-height-percent:0;mso-width-relative:margin;mso-height-relative:margin;v-text-anchor:top" o:gfxdata="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" stroked="f">
+                <v:textbox>
+                  <w:txbxContent>
+                    <w:p>
+                      <w:pPr>
+                        <w:rPr>
+                          <w:lang w:bidi="ar-YE"/>
+                        </w:rPr>
+                      </w:pPr>
+                      <w:r>
+                        <w:rPr>
+                          <w:b/>
+                          <w:bCs/>
+                          <w:noProof/>
+                          <w:lang w:bidi="ar-YE"/>
+                        </w:rPr>
+                        <w:t>{{</w:t>
+                      </w:r>
+                      <w:r>
+                        <w:rPr>
+                          <w:b/>
+                          <w:bCs/>
+                          <w:noProof/>
+                          <w:lang w:bidi="ar-YE"/>
+                        </w:rPr>
+                        <w:t>school_log</w:t>
+                      </w:r>
+                      <w:r>
+                        <w:rPr>
+                          <w:b/>
+                          <w:bCs/>
+                          <w:noProof/>
+                          <w:lang w:bidi="ar-YE"/>
+                        </w:rPr>
+                        <w:t>o}}</w:t>
+                      </w:r>
+                    </w:p>
+                  </w:txbxContent>
+                </v:textbox>
+                <w10:wrap type="square" anchorx="margin"/>
               </v:shape>
             </w:pict>
           </mc:Fallback>
@@ -904,7 +904,11 @@
       </w:r>
       <w:proofErr w:type="gramStart"/>
       <w:r>
-        <w:t>{{ loop</w:t>
+        <w:t xml:space="preserve">{{ </w:t>
+      </w:r>
+      <w:proofErr w:type="spellStart"/>
+      <w:r>
+        <w:t>loop</w:t>
       </w:r>
       <w:proofErr w:type="gramEnd"/>
       <w:r>
@@ -912,7 +916,11 @@
       </w:r>
       <w:proofErr w:type="gramStart"/>
       <w:r>
-        <w:t>index }</w:t>
+        <w:t>index</w:t>
+      </w:r>
+      <w:proofErr w:type="spellEnd"/>
+      <w:r>
+        <w:t xml:space="preserve"> }</w:t>
       </w:r>
       <w:proofErr w:type="gramEnd"/>
       <w:r>
@@ -920,7 +928,11 @@
       </w:r>
       <w:proofErr w:type="gramStart"/>
       <w:r>
-        <w:t>{{ q</w:t>
+        <w:t xml:space="preserve">{{ </w:t>
+      </w:r>
+      <w:proofErr w:type="spellStart"/>
+      <w:r>
+        <w:t>q</w:t>
       </w:r>
       <w:proofErr w:type="gramEnd"/>
       <w:r>
@@ -928,7 +940,11 @@
       </w:r>
       <w:proofErr w:type="gramStart"/>
       <w:r>
-        <w:t>question }</w:t>
+        <w:t>question</w:t>
+      </w:r>
+      <w:proofErr w:type="spellEnd"/>
+      <w:r>
+        <w:t xml:space="preserve"> }</w:t>
       </w:r>
       <w:proofErr w:type="gramEnd"/>
       <w:r>
@@ -953,14 +969,21 @@
       <w:r>
         <w:t xml:space="preserve">{% if </w:t>
       </w:r>
+      <w:proofErr w:type="spellStart"/>
       <w:proofErr w:type="gramStart"/>
       <w:r>
         <w:t>q.type</w:t>
       </w:r>
+      <w:proofErr w:type="spellEnd"/>
       <w:proofErr w:type="gramEnd"/>
       <w:r>
-        <w:t xml:space="preserve"> == 'mcq</w:t>
-      </w:r>
+        <w:t xml:space="preserve"> == '</w:t>
+      </w:r>
+      <w:proofErr w:type="spellStart"/>
+      <w:r>
+        <w:t>mcq</w:t>
+      </w:r>
+      <w:proofErr w:type="spellEnd"/>
       <w:proofErr w:type="gramStart"/>
       <w:r>
         <w:t>' %}</w:t>
@@ -974,10 +997,12 @@
       <w:r>
         <w:t xml:space="preserve">{% for opt in </w:t>
       </w:r>
+      <w:proofErr w:type="spellStart"/>
       <w:proofErr w:type="gramStart"/>
       <w:r>
         <w:t>q.options</w:t>
       </w:r>
+      <w:proofErr w:type="spellEnd"/>
       <w:proofErr w:type="gramEnd"/>
       <w:r>
         <w:t xml:space="preserve"> %}</w:t>
@@ -987,7 +1012,11 @@
       </w:r>
       <w:proofErr w:type="gramStart"/>
       <w:r>
-        <w:t>{{ loop</w:t>
+        <w:t xml:space="preserve">{{ </w:t>
+      </w:r>
+      <w:proofErr w:type="spellStart"/>
+      <w:r>
+        <w:t>loop</w:t>
       </w:r>
       <w:proofErr w:type="gramEnd"/>
       <w:r>
@@ -995,7 +1024,11 @@
       </w:r>
       <w:proofErr w:type="gramStart"/>
       <w:r>
-        <w:t>index }</w:t>
+        <w:t>index</w:t>
+      </w:r>
+      <w:proofErr w:type="spellEnd"/>
+      <w:r>
+        <w:t xml:space="preserve"> }</w:t>
       </w:r>
       <w:proofErr w:type="gramEnd"/>
       <w:r>
@@ -1024,7 +1057,15 @@
         </w:rPr>
       </w:pPr>
       <w:r>
-        <w:t>{% endfor %}</w:t>
+        <w:t xml:space="preserve">{% </w:t>
+      </w:r>
+      <w:proofErr w:type="spellStart"/>
+      <w:r>
+        <w:t>endfor</w:t>
+      </w:r>
+      <w:proofErr w:type="spellEnd"/>
+      <w:r>
+        <w:t xml:space="preserve"> %}</w:t>
       </w:r>
     </w:p>
     <w:p>
@@ -1035,15 +1076,33 @@
         </w:rPr>
       </w:pPr>
       <w:r>
-        <w:t xml:space="preserve">{% elif </w:t>
-      </w:r>
+        <w:t xml:space="preserve">{% </w:t>
+      </w:r>
+      <w:proofErr w:type="spellStart"/>
+      <w:r>
+        <w:t>elif</w:t>
+      </w:r>
+      <w:proofErr w:type="spellEnd"/>
+      <w:r>
+        <w:t xml:space="preserve"> </w:t>
+      </w:r>
+      <w:proofErr w:type="spellStart"/>
       <w:proofErr w:type="gramStart"/>
       <w:r>
         <w:t>q.type</w:t>
       </w:r>
+      <w:proofErr w:type="spellEnd"/>
       <w:proofErr w:type="gramEnd"/>
       <w:r>
-        <w:t xml:space="preserve"> == 'tf' </w:t>
+        <w:t xml:space="preserve"> == '</w:t>
+      </w:r>
+      <w:proofErr w:type="spellStart"/>
+      <w:r>
+        <w:t>tf</w:t>
+      </w:r>
+      <w:proofErr w:type="spellEnd"/>
+      <w:r>
+        <w:t xml:space="preserve">' </w:t>
       </w:r>
       <w:proofErr w:type="gramStart"/>
       <w:r>
@@ -1097,11 +1156,19 @@
         </w:rPr>
       </w:pPr>
       <w:r>
-        <w:t>{% if show_</w:t>
+        <w:t xml:space="preserve">{% if </w:t>
+      </w:r>
+      <w:proofErr w:type="spellStart"/>
+      <w:r>
+        <w:t>show_</w:t>
       </w:r>
       <w:proofErr w:type="gramStart"/>
       <w:r>
-        <w:t>answers %}</w:t>
+        <w:t>answers</w:t>
+      </w:r>
+      <w:proofErr w:type="spellEnd"/>
+      <w:r>
+        <w:t xml:space="preserve"> %}</w:t>
       </w:r>
       <w:proofErr w:type="gramEnd"/>
     </w:p>
@@ -1117,7 +1184,11 @@
       </w:r>
       <w:proofErr w:type="gramStart"/>
       <w:r>
-        <w:t>{{ q</w:t>
+        <w:t xml:space="preserve">{{ </w:t>
+      </w:r>
+      <w:proofErr w:type="spellStart"/>
+      <w:r>
+        <w:t>q</w:t>
       </w:r>
       <w:proofErr w:type="gramEnd"/>
       <w:r>
@@ -1125,7 +1196,11 @@
       </w:r>
       <w:proofErr w:type="gramStart"/>
       <w:r>
-        <w:t>answer }</w:t>
+        <w:t>answer</w:t>
+      </w:r>
+      <w:proofErr w:type="spellEnd"/>
+      <w:r>
+        <w:t xml:space="preserve"> }</w:t>
       </w:r>
       <w:proofErr w:type="gramEnd"/>
       <w:r>
@@ -1148,7 +1223,15 @@
         <w:spacing w:after="0"/>
       </w:pPr>
       <w:r>
-        <w:t>{% endfor %}</w:t>
+        <w:t xml:space="preserve">{% </w:t>
+      </w:r>
+      <w:proofErr w:type="spellStart"/>
+      <w:r>
+        <w:t>endfor</w:t>
+      </w:r>
+      <w:proofErr w:type="spellEnd"/>
+      <w:r>
+        <w:t xml:space="preserve"> %}</w:t>
       </w:r>
     </w:p>
     <w:p>
@@ -1828,6 +1911,7 @@
   <w:style w:type="character" w:default="1" w:styleId="DefaultParagraphFont">
     <w:name w:val="Default Paragraph Font"/>
     <w:uiPriority w:val="1"/>
+    <w:semiHidden/>
     <w:unhideWhenUsed/>
   </w:style>
   <w:style w:type="table" w:default="1" w:styleId="TableNormal">

</xml_diff>